<commit_message>
Add OrbitScreen game UI with Open Sans font, probe widget, and ship labels
- OrbitScreen with animated solar system (Proxima Centauri + 3 planets)
- Red dwarf sun image with solar flare glow, black space background
- Hover/tap labels for sun, planets, and background stars
- HUD bar, deploy panel, decision/init modal with directive choices
- Stationary probe widget (top-right) with PROMETHEUS name and Seed-Class label
- Open Sans font applied to all text styles and SVG labels
- Von Neumann probe research docs, game mechanics, and torch naming docs
</commit_message>
<xml_diff>
--- a/docs/ReplicantTorch/docs/STRATEGY_TREE.docx
+++ b/docs/ReplicantTorch/docs/STRATEGY_TREE.docx
@@ -2,7 +2,7 @@
 <file path=word/document.xml><?xml version="1.0" encoding="utf-8"?>
 <w:document xmlns:w="http://schemas.openxmlformats.org/wordprocessingml/2006/main" xmlns:m="http://schemas.openxmlformats.org/officeDocument/2006/math" xmlns:r="http://schemas.openxmlformats.org/officeDocument/2006/relationships" xmlns:o="urn:schemas-microsoft-com:office:office" xmlns:v="urn:schemas-microsoft-com:vml" xmlns:w10="urn:schemas-microsoft-com:office:word" xmlns:a="http://schemas.openxmlformats.org/drawingml/2006/main" xmlns:pic="http://schemas.openxmlformats.org/drawingml/2006/picture" xmlns:wp="http://schemas.openxmlformats.org/drawingml/2006/wordprocessingDrawing">
   <w:body>
-    <w:bookmarkStart w:id="46" w:name="replicant-torch---strategy-decision-tree"/>
+    <w:bookmarkStart w:id="56" w:name="replicant-torch---strategy-decision-tree"/>
     <w:p>
       <w:pPr>
         <w:pStyle w:val="Heading1"/>
@@ -10531,90 +10531,595 @@
     </w:p>
     <w:bookmarkEnd w:id="40"/>
     <w:bookmarkEnd w:id="41"/>
-    <w:bookmarkStart w:id="45" w:name="win-conditions"/>
+    <w:bookmarkStart w:id="51" w:name="starting-map-proxima-centauri-system"/>
     <w:p>
       <w:pPr>
         <w:pStyle w:val="Heading2"/>
       </w:pPr>
       <w:r>
-        <w:t xml:space="preserve">Win Conditions</w:t>
-      </w:r>
-    </w:p>
-    <w:bookmarkStart w:id="42" w:name="expansion-victory"/>
-    <w:p>
-      <w:pPr>
-        <w:pStyle w:val="Heading3"/>
-      </w:pPr>
-      <w:r>
-        <w:t xml:space="preserve">Expansion Victory</w:t>
-      </w:r>
-    </w:p>
-    <w:p>
-      <w:pPr>
-        <w:pStyle w:val="Compact"/>
-        <w:numPr>
-          <w:ilvl w:val="0"/>
-          <w:numId w:val="1004"/>
-        </w:numPr>
-      </w:pPr>
-      <w:r>
-        <w:t xml:space="preserve">Control a majority of star systems on the map</w:t>
-      </w:r>
-    </w:p>
-    <w:p>
-      <w:pPr>
-        <w:pStyle w:val="Compact"/>
-        <w:numPr>
-          <w:ilvl w:val="0"/>
-          <w:numId w:val="1004"/>
-        </w:numPr>
-      </w:pPr>
-      <w:r>
-        <w:t xml:space="preserve">Achieved by printing Torches and claiming systems faster than any opponent</w:t>
-      </w:r>
-    </w:p>
-    <w:p>
-      <w:pPr>
-        <w:pStyle w:val="Compact"/>
-        <w:numPr>
-          <w:ilvl w:val="0"/>
-          <w:numId w:val="1004"/>
-        </w:numPr>
-      </w:pPr>
+        <w:t xml:space="preserve">Starting Map — Proxima Centauri System</w:t>
+      </w:r>
+    </w:p>
+    <w:p>
+      <w:pPr>
+        <w:pStyle w:val="FirstParagraph"/>
+      </w:pPr>
+      <w:r>
+        <w:t xml:space="preserve">The Torch arrives in the</w:t>
+      </w:r>
+      <w:r>
+        <w:t xml:space="preserve"> </w:t>
+      </w:r>
       <w:r>
         <w:rPr>
           <w:b/>
           <w:bCs/>
         </w:rPr>
-        <w:t xml:space="preserve">Trade-offs:</w:t>
+        <w:t xml:space="preserve">Proxima Centauri system</w:t>
       </w:r>
       <w:r>
         <w:t xml:space="preserve"> </w:t>
       </w:r>
       <w:r>
-        <w:t xml:space="preserve">Energy flows to printers and Torches, not research — Era 4 elite tech is rarely reached; military units stay Era 1–2 quality; He-3 propulsion is used longer than the Tech path</w:t>
-      </w:r>
-    </w:p>
+        <w:t xml:space="preserve">— the closest star to Earth at 4.25 light years. A red dwarf of spectral class M5.5: 12.5% of the Sun’s mass, 14% of its diameter, and only 0.16% of its luminosity. Nearly all output is infrared. What it lacks in light it makes up for in violence — flares can reach 1,000x the star’s normal brightness, spike to 27 million K, and shower the inner system with X-rays and UV. Flare events are periodic, unpredictable, and damaging.</w:t>
+      </w:r>
+    </w:p>
+    <w:bookmarkStart w:id="42" w:name="the-star"/>
+    <w:p>
+      <w:pPr>
+        <w:pStyle w:val="Heading3"/>
+      </w:pPr>
+      <w:r>
+        <w:t xml:space="preserve">The Star</w:t>
+      </w:r>
+    </w:p>
+    <w:tbl>
+      <w:tblPr>
+        <w:tblStyle w:val="Table"/>
+        <w:tblW w:type="pct" w:w="5000"/>
+        <w:tblLayout w:type="fixed"/>
+        <w:tblLook w:firstRow="1" w:lastRow="0" w:firstColumn="0" w:lastColumn="0" w:noHBand="0" w:noVBand="0" w:val="0020"/>
+      </w:tblPr>
+      <w:tblGrid>
+        <w:gridCol w:w="4658"/>
+        <w:gridCol w:w="3261"/>
+      </w:tblGrid>
+      <w:tr>
+        <w:trPr>
+          <w:tblHeader w:val="on"/>
+        </w:trPr>
+        <w:tc>
+          <w:tcPr/>
+          <w:p>
+            <w:pPr>
+              <w:pStyle w:val="Compact"/>
+            </w:pPr>
+            <w:r>
+              <w:t xml:space="preserve">Property</w:t>
+            </w:r>
+          </w:p>
+        </w:tc>
+        <w:tc>
+          <w:tcPr/>
+          <w:p>
+            <w:pPr>
+              <w:pStyle w:val="Compact"/>
+            </w:pPr>
+            <w:r>
+              <w:t xml:space="preserve">Value</w:t>
+            </w:r>
+          </w:p>
+        </w:tc>
+      </w:tr>
+      <w:tr>
+        <w:tc>
+          <w:tcPr/>
+          <w:p>
+            <w:pPr>
+              <w:pStyle w:val="Compact"/>
+            </w:pPr>
+            <w:r>
+              <w:t xml:space="preserve">Type</w:t>
+            </w:r>
+          </w:p>
+        </w:tc>
+        <w:tc>
+          <w:tcPr/>
+          <w:p>
+            <w:pPr>
+              <w:pStyle w:val="Compact"/>
+            </w:pPr>
+            <w:r>
+              <w:t xml:space="preserve">M5.5 red dwarf</w:t>
+            </w:r>
+          </w:p>
+        </w:tc>
+      </w:tr>
+      <w:tr>
+        <w:tc>
+          <w:tcPr/>
+          <w:p>
+            <w:pPr>
+              <w:pStyle w:val="Compact"/>
+            </w:pPr>
+            <w:r>
+              <w:t xml:space="preserve">Mass</w:t>
+            </w:r>
+          </w:p>
+        </w:tc>
+        <w:tc>
+          <w:tcPr/>
+          <w:p>
+            <w:pPr>
+              <w:pStyle w:val="Compact"/>
+            </w:pPr>
+            <w:r>
+              <w:t xml:space="preserve">12.5% of Sun</w:t>
+            </w:r>
+          </w:p>
+        </w:tc>
+      </w:tr>
+      <w:tr>
+        <w:tc>
+          <w:tcPr/>
+          <w:p>
+            <w:pPr>
+              <w:pStyle w:val="Compact"/>
+            </w:pPr>
+            <w:r>
+              <w:t xml:space="preserve">Diameter</w:t>
+            </w:r>
+          </w:p>
+        </w:tc>
+        <w:tc>
+          <w:tcPr/>
+          <w:p>
+            <w:pPr>
+              <w:pStyle w:val="Compact"/>
+            </w:pPr>
+            <w:r>
+              <w:t xml:space="preserve">14% of Sun</w:t>
+            </w:r>
+          </w:p>
+        </w:tc>
+      </w:tr>
+      <w:tr>
+        <w:tc>
+          <w:tcPr/>
+          <w:p>
+            <w:pPr>
+              <w:pStyle w:val="Compact"/>
+            </w:pPr>
+            <w:r>
+              <w:t xml:space="preserve">Luminosity</w:t>
+            </w:r>
+          </w:p>
+        </w:tc>
+        <w:tc>
+          <w:tcPr/>
+          <w:p>
+            <w:pPr>
+              <w:pStyle w:val="Compact"/>
+            </w:pPr>
+            <w:r>
+              <w:t xml:space="preserve">0.16% of Sun (mostly infrared)</w:t>
+            </w:r>
+          </w:p>
+        </w:tc>
+      </w:tr>
+      <w:tr>
+        <w:tc>
+          <w:tcPr/>
+          <w:p>
+            <w:pPr>
+              <w:pStyle w:val="Compact"/>
+            </w:pPr>
+            <w:r>
+              <w:t xml:space="preserve">Flare Activity</w:t>
+            </w:r>
+          </w:p>
+        </w:tc>
+        <w:tc>
+          <w:tcPr/>
+          <w:p>
+            <w:pPr>
+              <w:pStyle w:val="Compact"/>
+            </w:pPr>
+            <w:r>
+              <w:t xml:space="preserve">Extreme — up to 1,000x quiescent brightness</w:t>
+            </w:r>
+          </w:p>
+        </w:tc>
+      </w:tr>
+      <w:tr>
+        <w:tc>
+          <w:tcPr/>
+          <w:p>
+            <w:pPr>
+              <w:pStyle w:val="Compact"/>
+            </w:pPr>
+            <w:r>
+              <w:t xml:space="preserve">Radiation</w:t>
+            </w:r>
+          </w:p>
+        </w:tc>
+        <w:tc>
+          <w:tcPr/>
+          <w:p>
+            <w:pPr>
+              <w:pStyle w:val="Compact"/>
+            </w:pPr>
+            <w:r>
+              <w:t xml:space="preserve">High X-ray and UV during flares — damages unshielded drones and Solar Arrays</w:t>
+            </w:r>
+          </w:p>
+        </w:tc>
+      </w:tr>
+    </w:tbl>
     <w:bookmarkEnd w:id="42"/>
-    <w:bookmarkStart w:id="43" w:name="tech-victory"/>
+    <w:bookmarkStart w:id="43" w:name="orbital-bodies"/>
     <w:p>
       <w:pPr>
         <w:pStyle w:val="Heading3"/>
       </w:pPr>
       <w:r>
-        <w:t xml:space="preserve">Tech Victory</w:t>
-      </w:r>
-    </w:p>
-    <w:p>
-      <w:pPr>
-        <w:pStyle w:val="Compact"/>
-        <w:numPr>
-          <w:ilvl w:val="0"/>
-          <w:numId w:val="1005"/>
-        </w:numPr>
-      </w:pPr>
-      <w:r>
-        <w:t xml:space="preserve">Complete the full local research tree and construct the</w:t>
+        <w:t xml:space="preserve">Orbital Bodies</w:t>
+      </w:r>
+    </w:p>
+    <w:tbl>
+      <w:tblPr>
+        <w:tblStyle w:val="Table"/>
+        <w:tblW w:type="pct" w:w="5000"/>
+        <w:tblLayout w:type="fixed"/>
+        <w:tblLook w:firstRow="1" w:lastRow="0" w:firstColumn="0" w:lastColumn="0" w:noHBand="0" w:noVBand="0" w:val="0020"/>
+      </w:tblPr>
+      <w:tblGrid>
+        <w:gridCol w:w="633"/>
+        <w:gridCol w:w="1584"/>
+        <w:gridCol w:w="1689"/>
+        <w:gridCol w:w="633"/>
+        <w:gridCol w:w="1584"/>
+        <w:gridCol w:w="1056"/>
+        <w:gridCol w:w="739"/>
+      </w:tblGrid>
+      <w:tr>
+        <w:trPr>
+          <w:tblHeader w:val="on"/>
+        </w:trPr>
+        <w:tc>
+          <w:tcPr/>
+          <w:p>
+            <w:pPr>
+              <w:pStyle w:val="Compact"/>
+            </w:pPr>
+            <w:r>
+              <w:t xml:space="preserve">Body</w:t>
+            </w:r>
+          </w:p>
+        </w:tc>
+        <w:tc>
+          <w:tcPr/>
+          <w:p>
+            <w:pPr>
+              <w:pStyle w:val="Compact"/>
+            </w:pPr>
+            <w:r>
+              <w:t xml:space="preserve">Orbital Period</w:t>
+            </w:r>
+          </w:p>
+        </w:tc>
+        <w:tc>
+          <w:tcPr/>
+          <w:p>
+            <w:pPr>
+              <w:pStyle w:val="Compact"/>
+            </w:pPr>
+            <w:r>
+              <w:t xml:space="preserve">Orbital Radius</w:t>
+            </w:r>
+          </w:p>
+        </w:tc>
+        <w:tc>
+          <w:tcPr/>
+          <w:p>
+            <w:pPr>
+              <w:pStyle w:val="Compact"/>
+            </w:pPr>
+            <w:r>
+              <w:t xml:space="preserve">Mass</w:t>
+            </w:r>
+          </w:p>
+        </w:tc>
+        <w:tc>
+          <w:tcPr/>
+          <w:p>
+            <w:pPr>
+              <w:pStyle w:val="Compact"/>
+            </w:pPr>
+            <w:r>
+              <w:t xml:space="preserve">Spectral Class</w:t>
+            </w:r>
+          </w:p>
+        </w:tc>
+        <w:tc>
+          <w:tcPr/>
+          <w:p>
+            <w:pPr>
+              <w:pStyle w:val="Compact"/>
+            </w:pPr>
+            <w:r>
+              <w:t xml:space="preserve">Rotation</w:t>
+            </w:r>
+          </w:p>
+        </w:tc>
+        <w:tc>
+          <w:tcPr/>
+          <w:p>
+            <w:pPr>
+              <w:pStyle w:val="Compact"/>
+            </w:pPr>
+            <w:r>
+              <w:t xml:space="preserve">Notes</w:t>
+            </w:r>
+          </w:p>
+        </w:tc>
+      </w:tr>
+      <w:tr>
+        <w:tc>
+          <w:tcPr/>
+          <w:p>
+            <w:pPr>
+              <w:pStyle w:val="Compact"/>
+            </w:pPr>
+            <w:r>
+              <w:rPr>
+                <w:b/>
+                <w:bCs/>
+              </w:rPr>
+              <w:t xml:space="preserve">Proxima d</w:t>
+            </w:r>
+          </w:p>
+        </w:tc>
+        <w:tc>
+          <w:tcPr/>
+          <w:p>
+            <w:pPr>
+              <w:pStyle w:val="Compact"/>
+            </w:pPr>
+            <w:r>
+              <w:t xml:space="preserve">5.1 days</w:t>
+            </w:r>
+          </w:p>
+        </w:tc>
+        <w:tc>
+          <w:tcPr/>
+          <w:p>
+            <w:pPr>
+              <w:pStyle w:val="Compact"/>
+            </w:pPr>
+            <w:r>
+              <w:t xml:space="preserve">0.029 AU</w:t>
+            </w:r>
+          </w:p>
+        </w:tc>
+        <w:tc>
+          <w:tcPr/>
+          <w:p>
+            <w:pPr>
+              <w:pStyle w:val="Compact"/>
+            </w:pPr>
+            <w:r>
+              <w:t xml:space="preserve">0.26 Earth</w:t>
+            </w:r>
+          </w:p>
+        </w:tc>
+        <w:tc>
+          <w:tcPr/>
+          <w:p>
+            <w:pPr>
+              <w:pStyle w:val="Compact"/>
+            </w:pPr>
+            <w:r>
+              <w:t xml:space="preserve">B</w:t>
+            </w:r>
+          </w:p>
+        </w:tc>
+        <w:tc>
+          <w:tcPr/>
+          <w:p>
+            <w:pPr>
+              <w:pStyle w:val="Compact"/>
+            </w:pPr>
+            <w:r>
+              <w:t xml:space="preserve">Tidally locked</w:t>
+            </w:r>
+          </w:p>
+        </w:tc>
+        <w:tc>
+          <w:tcPr/>
+          <w:p>
+            <w:pPr>
+              <w:pStyle w:val="Compact"/>
+            </w:pPr>
+            <w:r>
+              <w:t xml:space="preserve">Innermost; one face permanently toward star</w:t>
+            </w:r>
+          </w:p>
+        </w:tc>
+      </w:tr>
+      <w:tr>
+        <w:tc>
+          <w:tcPr/>
+          <w:p>
+            <w:pPr>
+              <w:pStyle w:val="Compact"/>
+            </w:pPr>
+            <w:r>
+              <w:rPr>
+                <w:b/>
+                <w:bCs/>
+              </w:rPr>
+              <w:t xml:space="preserve">Proxima b</w:t>
+            </w:r>
+          </w:p>
+        </w:tc>
+        <w:tc>
+          <w:tcPr/>
+          <w:p>
+            <w:pPr>
+              <w:pStyle w:val="Compact"/>
+            </w:pPr>
+            <w:r>
+              <w:t xml:space="preserve">11.2 days</w:t>
+            </w:r>
+          </w:p>
+        </w:tc>
+        <w:tc>
+          <w:tcPr/>
+          <w:p>
+            <w:pPr>
+              <w:pStyle w:val="Compact"/>
+            </w:pPr>
+            <w:r>
+              <w:t xml:space="preserve">0.048 AU</w:t>
+            </w:r>
+          </w:p>
+        </w:tc>
+        <w:tc>
+          <w:tcPr/>
+          <w:p>
+            <w:pPr>
+              <w:pStyle w:val="Compact"/>
+            </w:pPr>
+            <w:r>
+              <w:t xml:space="preserve">1.055 Earth</w:t>
+            </w:r>
+          </w:p>
+        </w:tc>
+        <w:tc>
+          <w:tcPr/>
+          <w:p>
+            <w:pPr>
+              <w:pStyle w:val="Compact"/>
+            </w:pPr>
+            <w:r>
+              <w:t xml:space="preserve">A</w:t>
+            </w:r>
+          </w:p>
+        </w:tc>
+        <w:tc>
+          <w:tcPr/>
+          <w:p>
+            <w:pPr>
+              <w:pStyle w:val="Compact"/>
+            </w:pPr>
+            <w:r>
+              <w:t xml:space="preserve">Tidally locked</w:t>
+            </w:r>
+          </w:p>
+        </w:tc>
+        <w:tc>
+          <w:tcPr/>
+          <w:p>
+            <w:pPr>
+              <w:pStyle w:val="Compact"/>
+            </w:pPr>
+            <w:r>
+              <w:t xml:space="preserve">Habitable zone; permanent day/night sides</w:t>
+            </w:r>
+          </w:p>
+        </w:tc>
+      </w:tr>
+      <w:tr>
+        <w:tc>
+          <w:tcPr/>
+          <w:p>
+            <w:pPr>
+              <w:pStyle w:val="Compact"/>
+            </w:pPr>
+            <w:r>
+              <w:rPr>
+                <w:b/>
+                <w:bCs/>
+              </w:rPr>
+              <w:t xml:space="preserve">Proxima c</w:t>
+            </w:r>
+          </w:p>
+        </w:tc>
+        <w:tc>
+          <w:tcPr/>
+          <w:p>
+            <w:pPr>
+              <w:pStyle w:val="Compact"/>
+            </w:pPr>
+            <w:r>
+              <w:t xml:space="preserve">~1,900 days</w:t>
+            </w:r>
+          </w:p>
+        </w:tc>
+        <w:tc>
+          <w:tcPr/>
+          <w:p>
+            <w:pPr>
+              <w:pStyle w:val="Compact"/>
+            </w:pPr>
+            <w:r>
+              <w:t xml:space="preserve">1.489 AU</w:t>
+            </w:r>
+          </w:p>
+        </w:tc>
+        <w:tc>
+          <w:tcPr/>
+          <w:p>
+            <w:pPr>
+              <w:pStyle w:val="Compact"/>
+            </w:pPr>
+            <w:r>
+              <w:t xml:space="preserve">Unknown</w:t>
+            </w:r>
+          </w:p>
+        </w:tc>
+        <w:tc>
+          <w:tcPr/>
+          <w:p>
+            <w:pPr>
+              <w:pStyle w:val="Compact"/>
+            </w:pPr>
+            <w:r>
+              <w:t xml:space="preserve">Unknown</w:t>
+            </w:r>
+          </w:p>
+        </w:tc>
+        <w:tc>
+          <w:tcPr/>
+          <w:p>
+            <w:pPr>
+              <w:pStyle w:val="Compact"/>
+            </w:pPr>
+            <w:r>
+              <w:t xml:space="preserve">Unknown</w:t>
+            </w:r>
+          </w:p>
+        </w:tc>
+        <w:tc>
+          <w:tcPr/>
+          <w:p>
+            <w:pPr>
+              <w:pStyle w:val="Compact"/>
+            </w:pPr>
+            <w:r>
+              <w:t xml:space="preserve">Disputed — appears as anomaly signal in outer system</w:t>
+            </w:r>
+          </w:p>
+        </w:tc>
+      </w:tr>
+    </w:tbl>
+    <w:p>
+      <w:pPr>
+        <w:pStyle w:val="BodyText"/>
+      </w:pPr>
+      <w:r>
+        <w:t xml:space="preserve">Both confirmed planets are on</w:t>
       </w:r>
       <w:r>
         <w:t xml:space="preserve"> </w:t>
@@ -10624,57 +11129,217 @@
           <w:b/>
           <w:bCs/>
         </w:rPr>
-        <w:t xml:space="preserve">Capstone Structure</w:t>
+        <w:t xml:space="preserve">perfectly circular orbits</w:t>
       </w:r>
       <w:r>
         <w:t xml:space="preserve"> </w:t>
       </w:r>
       <w:r>
-        <w:t xml:space="preserve">(TBD)</w:t>
-      </w:r>
-    </w:p>
-    <w:p>
-      <w:pPr>
-        <w:pStyle w:val="Compact"/>
-        <w:numPr>
-          <w:ilvl w:val="0"/>
-          <w:numId w:val="1005"/>
-        </w:numPr>
-      </w:pPr>
-      <w:r>
-        <w:t xml:space="preserve">Achieved by investing deeply in Research Stations and upgrades before replicating</w:t>
-      </w:r>
-    </w:p>
-    <w:p>
-      <w:pPr>
-        <w:pStyle w:val="Compact"/>
-        <w:numPr>
-          <w:ilvl w:val="0"/>
-          <w:numId w:val="1005"/>
-        </w:numPr>
-      </w:pPr>
+        <w:t xml:space="preserve">and almost certainly</w:t>
+      </w:r>
+      <w:r>
+        <w:t xml:space="preserve"> </w:t>
+      </w:r>
       <w:r>
         <w:rPr>
           <w:b/>
           <w:bCs/>
         </w:rPr>
-        <w:t xml:space="preserve">Trade-offs:</w:t>
+        <w:t xml:space="preserve">tidally locked</w:t>
       </w:r>
       <w:r>
         <w:t xml:space="preserve"> </w:t>
       </w:r>
       <w:r>
-        <w:t xml:space="preserve">Small empire footprint; fewer raw resources; vulnerable mid-game until tech matures</w:t>
+        <w:t xml:space="preserve">— one hemisphere permanently facing the star, one permanently dark.</w:t>
       </w:r>
     </w:p>
     <w:bookmarkEnd w:id="43"/>
-    <w:bookmarkStart w:id="44" w:name="balance-lever-energy"/>
+    <w:bookmarkStart w:id="44" w:name="tidal-locking-strategic-implications"/>
     <w:p>
       <w:pPr>
         <w:pStyle w:val="Heading3"/>
       </w:pPr>
       <w:r>
-        <w:t xml:space="preserve">Balance Lever — Energy</w:t>
+        <w:t xml:space="preserve">Tidal Locking — Strategic Implications</w:t>
+      </w:r>
+    </w:p>
+    <w:tbl>
+      <w:tblPr>
+        <w:tblStyle w:val="Table"/>
+        <w:tblW w:type="pct" w:w="5000"/>
+        <w:tblLayout w:type="fixed"/>
+        <w:tblLook w:firstRow="1" w:lastRow="0" w:firstColumn="0" w:lastColumn="0" w:noHBand="0" w:noVBand="0" w:val="0020"/>
+      </w:tblPr>
+      <w:tblGrid>
+        <w:gridCol w:w="931"/>
+        <w:gridCol w:w="1708"/>
+        <w:gridCol w:w="5280"/>
+      </w:tblGrid>
+      <w:tr>
+        <w:trPr>
+          <w:tblHeader w:val="on"/>
+        </w:trPr>
+        <w:tc>
+          <w:tcPr/>
+          <w:p>
+            <w:pPr>
+              <w:pStyle w:val="Compact"/>
+            </w:pPr>
+            <w:r>
+              <w:t xml:space="preserve">Zone</w:t>
+            </w:r>
+          </w:p>
+        </w:tc>
+        <w:tc>
+          <w:tcPr/>
+          <w:p>
+            <w:pPr>
+              <w:pStyle w:val="Compact"/>
+            </w:pPr>
+            <w:r>
+              <w:t xml:space="preserve">Condition</w:t>
+            </w:r>
+          </w:p>
+        </w:tc>
+        <w:tc>
+          <w:tcPr/>
+          <w:p>
+            <w:pPr>
+              <w:pStyle w:val="Compact"/>
+            </w:pPr>
+            <w:r>
+              <w:t xml:space="preserve">Resource / Tactical Implication</w:t>
+            </w:r>
+          </w:p>
+        </w:tc>
+      </w:tr>
+      <w:tr>
+        <w:tc>
+          <w:tcPr/>
+          <w:p>
+            <w:pPr>
+              <w:pStyle w:val="Compact"/>
+            </w:pPr>
+            <w:r>
+              <w:rPr>
+                <w:b/>
+                <w:bCs/>
+              </w:rPr>
+              <w:t xml:space="preserve">Day side</w:t>
+            </w:r>
+          </w:p>
+        </w:tc>
+        <w:tc>
+          <w:tcPr/>
+          <w:p>
+            <w:pPr>
+              <w:pStyle w:val="Compact"/>
+            </w:pPr>
+            <w:r>
+              <w:t xml:space="preserve">Constant stellar radiation; periodic flare spikes</w:t>
+            </w:r>
+          </w:p>
+        </w:tc>
+        <w:tc>
+          <w:tcPr/>
+          <w:p>
+            <w:pPr>
+              <w:pStyle w:val="Compact"/>
+            </w:pPr>
+            <w:r>
+              <w:t xml:space="preserve">Solar Arrays highly efficient — but flare events deal damage to unshielded drones</w:t>
+            </w:r>
+          </w:p>
+        </w:tc>
+      </w:tr>
+      <w:tr>
+        <w:tc>
+          <w:tcPr/>
+          <w:p>
+            <w:pPr>
+              <w:pStyle w:val="Compact"/>
+            </w:pPr>
+            <w:r>
+              <w:rPr>
+                <w:b/>
+                <w:bCs/>
+              </w:rPr>
+              <w:t xml:space="preserve">Night side</w:t>
+            </w:r>
+          </w:p>
+        </w:tc>
+        <w:tc>
+          <w:tcPr/>
+          <w:p>
+            <w:pPr>
+              <w:pStyle w:val="Compact"/>
+            </w:pPr>
+            <w:r>
+              <w:t xml:space="preserve">Permanent darkness, extreme cold</w:t>
+            </w:r>
+          </w:p>
+        </w:tc>
+        <w:tc>
+          <w:tcPr/>
+          <w:p>
+            <w:pPr>
+              <w:pStyle w:val="Compact"/>
+            </w:pPr>
+            <w:r>
+              <w:t xml:space="preserve">Shielded from radiation; stable long-term mining zone</w:t>
+            </w:r>
+          </w:p>
+        </w:tc>
+      </w:tr>
+      <w:tr>
+        <w:tc>
+          <w:tcPr/>
+          <w:p>
+            <w:pPr>
+              <w:pStyle w:val="Compact"/>
+            </w:pPr>
+            <w:r>
+              <w:rPr>
+                <w:b/>
+                <w:bCs/>
+              </w:rPr>
+              <w:t xml:space="preserve">Terminator ring</w:t>
+            </w:r>
+          </w:p>
+        </w:tc>
+        <w:tc>
+          <w:tcPr/>
+          <w:p>
+            <w:pPr>
+              <w:pStyle w:val="Compact"/>
+            </w:pPr>
+            <w:r>
+              <w:t xml:space="preserve">Narrow twilight band between day and night</w:t>
+            </w:r>
+          </w:p>
+        </w:tc>
+        <w:tc>
+          <w:tcPr/>
+          <w:p>
+            <w:pPr>
+              <w:pStyle w:val="Compact"/>
+            </w:pPr>
+            <w:r>
+              <w:t xml:space="preserve">Most stable conditions; optimal zone for Station placement</w:t>
+            </w:r>
+          </w:p>
+        </w:tc>
+      </w:tr>
+    </w:tbl>
+    <w:bookmarkEnd w:id="44"/>
+    <w:bookmarkStart w:id="45" w:name="proxima-c-the-unknown-signal"/>
+    <w:p>
+      <w:pPr>
+        <w:pStyle w:val="Heading3"/>
+      </w:pPr>
+      <w:r>
+        <w:t xml:space="preserve">Proxima c — The Unknown Signal</w:t>
       </w:r>
     </w:p>
     <w:p>
@@ -10682,7 +11347,59 @@
         <w:pStyle w:val="FirstParagraph"/>
       </w:pPr>
       <w:r>
-        <w:t xml:space="preserve">Both paths compete for the same resource. Energy spent on expansion delays tech. Energy spent on tech delays expansion. This forces path commitment.</w:t>
+        <w:t xml:space="preserve">Proxima c has never been confirmed. It appears in the outer system as a</w:t>
+      </w:r>
+      <w:r>
+        <w:t xml:space="preserve"> </w:t>
+      </w:r>
+      <w:r>
+        <w:rPr>
+          <w:b/>
+          <w:bCs/>
+        </w:rPr>
+        <w:t xml:space="preserve">Class Unknown anomaly signal</w:t>
+      </w:r>
+      <w:r>
+        <w:t xml:space="preserve"> </w:t>
+      </w:r>
+      <w:r>
+        <w:t xml:space="preserve">detectable by Era 1 Scout drones — an unresolved spectral signature at ~1.5 AU. What it is remains unknown until a Scout surveys it:</w:t>
+      </w:r>
+      <w:r>
+        <w:t xml:space="preserve"> </w:t>
+      </w:r>
+      <w:r>
+        <w:t xml:space="preserve">- A frozen outer body (disputed, may not exist)</w:t>
+      </w:r>
+      <w:r>
+        <w:t xml:space="preserve"> </w:t>
+      </w:r>
+      <w:r>
+        <w:t xml:space="preserve">- A dense Rare Metal deposit from an ancient stellar event</w:t>
+      </w:r>
+      <w:r>
+        <w:t xml:space="preserve"> </w:t>
+      </w:r>
+      <w:r>
+        <w:t xml:space="preserve">- Something else entirely</w:t>
+      </w:r>
+    </w:p>
+    <w:bookmarkEnd w:id="45"/>
+    <w:bookmarkStart w:id="46" w:name="star-system-info-card"/>
+    <w:p>
+      <w:pPr>
+        <w:pStyle w:val="Heading3"/>
+      </w:pPr>
+      <w:r>
+        <w:t xml:space="preserve">Star System Info Card</w:t>
+      </w:r>
+    </w:p>
+    <w:p>
+      <w:pPr>
+        <w:pStyle w:val="FirstParagraph"/>
+      </w:pPr>
+      <w:r>
+        <w:t xml:space="preserve">When a player clicks on the Proxima Centauri system node, the info card displays:</w:t>
       </w:r>
     </w:p>
     <w:tbl>
@@ -10706,71 +11423,546 @@
               <w:pStyle w:val="Compact"/>
             </w:pPr>
             <w:r>
-              <w:t xml:space="preserve">Energy Spent On</w:t>
-            </w:r>
-          </w:p>
-        </w:tc>
-        <w:tc>
-          <w:tcPr/>
-          <w:p>
-            <w:pPr>
-              <w:pStyle w:val="Compact"/>
-            </w:pPr>
-            <w:r>
-              <w:t xml:space="preserve">Result</w:t>
-            </w:r>
-          </w:p>
-        </w:tc>
-      </w:tr>
-      <w:tr>
-        <w:tc>
-          <w:tcPr/>
-          <w:p>
-            <w:pPr>
-              <w:pStyle w:val="Compact"/>
-            </w:pPr>
-            <w:r>
-              <w:t xml:space="preserve">New Printers / Torches</w:t>
-            </w:r>
-          </w:p>
-        </w:tc>
-        <w:tc>
-          <w:tcPr/>
-          <w:p>
-            <w:pPr>
-              <w:pStyle w:val="Compact"/>
-            </w:pPr>
-            <w:r>
-              <w:t xml:space="preserve">Faster expansion, delayed tech</w:t>
-            </w:r>
-          </w:p>
-        </w:tc>
-      </w:tr>
-      <w:tr>
-        <w:tc>
-          <w:tcPr/>
-          <w:p>
-            <w:pPr>
-              <w:pStyle w:val="Compact"/>
-            </w:pPr>
-            <w:r>
-              <w:t xml:space="preserve">Research Stations / Upgrades</w:t>
-            </w:r>
-          </w:p>
-        </w:tc>
-        <w:tc>
-          <w:tcPr/>
-          <w:p>
-            <w:pPr>
-              <w:pStyle w:val="Compact"/>
-            </w:pPr>
-            <w:r>
-              <w:t xml:space="preserve">Deeper tech, slower footprint</w:t>
+              <w:t xml:space="preserve">Field</w:t>
+            </w:r>
+          </w:p>
+        </w:tc>
+        <w:tc>
+          <w:tcPr/>
+          <w:p>
+            <w:pPr>
+              <w:pStyle w:val="Compact"/>
+            </w:pPr>
+            <w:r>
+              <w:t xml:space="preserve">Value</w:t>
+            </w:r>
+          </w:p>
+        </w:tc>
+      </w:tr>
+      <w:tr>
+        <w:tc>
+          <w:tcPr/>
+          <w:p>
+            <w:pPr>
+              <w:pStyle w:val="Compact"/>
+            </w:pPr>
+            <w:r>
+              <w:t xml:space="preserve">Star Type</w:t>
+            </w:r>
+          </w:p>
+        </w:tc>
+        <w:tc>
+          <w:tcPr/>
+          <w:p>
+            <w:pPr>
+              <w:pStyle w:val="Compact"/>
+            </w:pPr>
+            <w:r>
+              <w:t xml:space="preserve">M5.5 Red Dwarf</w:t>
+            </w:r>
+          </w:p>
+        </w:tc>
+      </w:tr>
+      <w:tr>
+        <w:tc>
+          <w:tcPr/>
+          <w:p>
+            <w:pPr>
+              <w:pStyle w:val="Compact"/>
+            </w:pPr>
+            <w:r>
+              <w:t xml:space="preserve">Mass</w:t>
+            </w:r>
+          </w:p>
+        </w:tc>
+        <w:tc>
+          <w:tcPr/>
+          <w:p>
+            <w:pPr>
+              <w:pStyle w:val="Compact"/>
+            </w:pPr>
+            <w:r>
+              <w:t xml:space="preserve">0.125 M☉</w:t>
+            </w:r>
+          </w:p>
+        </w:tc>
+      </w:tr>
+      <w:tr>
+        <w:tc>
+          <w:tcPr/>
+          <w:p>
+            <w:pPr>
+              <w:pStyle w:val="Compact"/>
+            </w:pPr>
+            <w:r>
+              <w:t xml:space="preserve">Diameter</w:t>
+            </w:r>
+          </w:p>
+        </w:tc>
+        <w:tc>
+          <w:tcPr/>
+          <w:p>
+            <w:pPr>
+              <w:pStyle w:val="Compact"/>
+            </w:pPr>
+            <w:r>
+              <w:t xml:space="preserve">0.14 D☉</w:t>
+            </w:r>
+          </w:p>
+        </w:tc>
+      </w:tr>
+      <w:tr>
+        <w:tc>
+          <w:tcPr/>
+          <w:p>
+            <w:pPr>
+              <w:pStyle w:val="Compact"/>
+            </w:pPr>
+            <w:r>
+              <w:t xml:space="preserve">Luminosity</w:t>
+            </w:r>
+          </w:p>
+        </w:tc>
+        <w:tc>
+          <w:tcPr/>
+          <w:p>
+            <w:pPr>
+              <w:pStyle w:val="Compact"/>
+            </w:pPr>
+            <w:r>
+              <w:t xml:space="preserve">0.0016 L☉</w:t>
+            </w:r>
+          </w:p>
+        </w:tc>
+      </w:tr>
+      <w:tr>
+        <w:tc>
+          <w:tcPr/>
+          <w:p>
+            <w:pPr>
+              <w:pStyle w:val="Compact"/>
+            </w:pPr>
+            <w:r>
+              <w:t xml:space="preserve">Flare Risk</w:t>
+            </w:r>
+          </w:p>
+        </w:tc>
+        <w:tc>
+          <w:tcPr/>
+          <w:p>
+            <w:pPr>
+              <w:pStyle w:val="Compact"/>
+            </w:pPr>
+            <w:r>
+              <w:t xml:space="preserve">High</w:t>
+            </w:r>
+          </w:p>
+        </w:tc>
+      </w:tr>
+      <w:tr>
+        <w:tc>
+          <w:tcPr/>
+          <w:p>
+            <w:pPr>
+              <w:pStyle w:val="Compact"/>
+            </w:pPr>
+            <w:r>
+              <w:t xml:space="preserve">Known Bodies</w:t>
+            </w:r>
+          </w:p>
+        </w:tc>
+        <w:tc>
+          <w:tcPr/>
+          <w:p>
+            <w:pPr>
+              <w:pStyle w:val="Compact"/>
+            </w:pPr>
+            <w:r>
+              <w:t xml:space="preserve">2 confirmed + 1 anomaly signal</w:t>
+            </w:r>
+          </w:p>
+        </w:tc>
+      </w:tr>
+      <w:tr>
+        <w:tc>
+          <w:tcPr/>
+          <w:p>
+            <w:pPr>
+              <w:pStyle w:val="Compact"/>
+            </w:pPr>
+            <w:r>
+              <w:t xml:space="preserve">Power Grid Bonus</w:t>
+            </w:r>
+          </w:p>
+        </w:tc>
+        <w:tc>
+          <w:tcPr/>
+          <w:p>
+            <w:pPr>
+              <w:pStyle w:val="Compact"/>
+            </w:pPr>
+            <w:r>
+              <w:t xml:space="preserve">None (standard)</w:t>
             </w:r>
           </w:p>
         </w:tc>
       </w:tr>
     </w:tbl>
+    <w:bookmarkEnd w:id="46"/>
+    <w:bookmarkStart w:id="47" w:name="torch-starting-position"/>
+    <w:p>
+      <w:pPr>
+        <w:pStyle w:val="Heading3"/>
+      </w:pPr>
+      <w:r>
+        <w:t xml:space="preserve">Torch Starting Position</w:t>
+      </w:r>
+    </w:p>
+    <w:p>
+      <w:pPr>
+        <w:pStyle w:val="FirstParagraph"/>
+      </w:pPr>
+      <w:r>
+        <w:t xml:space="preserve">The Torch enters on an elliptical orbit crossing between b and c:</w:t>
+      </w:r>
+      <w:r>
+        <w:t xml:space="preserve"> </w:t>
+      </w:r>
+      <w:r>
+        <w:t xml:space="preserve">-</w:t>
+      </w:r>
+      <w:r>
+        <w:t xml:space="preserve"> </w:t>
+      </w:r>
+      <w:r>
+        <w:rPr>
+          <w:b/>
+          <w:bCs/>
+        </w:rPr>
+        <w:t xml:space="preserve">Perihelion</w:t>
+      </w:r>
+      <w:r>
+        <w:t xml:space="preserve"> </w:t>
+      </w:r>
+      <w:r>
+        <w:t xml:space="preserve">(close pass): near Proxima d and b — fast access to Raw Materials</w:t>
+      </w:r>
+      <w:r>
+        <w:t xml:space="preserve"> </w:t>
+      </w:r>
+      <w:r>
+        <w:t xml:space="preserve">-</w:t>
+      </w:r>
+      <w:r>
+        <w:t xml:space="preserve"> </w:t>
+      </w:r>
+      <w:r>
+        <w:rPr>
+          <w:b/>
+          <w:bCs/>
+        </w:rPr>
+        <w:t xml:space="preserve">Aphelion</w:t>
+      </w:r>
+      <w:r>
+        <w:t xml:space="preserve"> </w:t>
+      </w:r>
+      <w:r>
+        <w:t xml:space="preserve">(far pass): near Proxima c signal — anomaly survey range</w:t>
+      </w:r>
+    </w:p>
+    <w:bookmarkEnd w:id="47"/>
+    <w:bookmarkStart w:id="48" w:name="resource-collection"/>
+    <w:p>
+      <w:pPr>
+        <w:pStyle w:val="Heading3"/>
+      </w:pPr>
+      <w:r>
+        <w:t xml:space="preserve">Resource Collection</w:t>
+      </w:r>
+    </w:p>
+    <w:p>
+      <w:pPr>
+        <w:pStyle w:val="FirstParagraph"/>
+      </w:pPr>
+      <w:r>
+        <w:t xml:space="preserve">Once a drone is assigned to a collection point it gathers automatically each turn — no manual dispatching required. The Power Grid updates continuously as drones work.</w:t>
+      </w:r>
+    </w:p>
+    <w:bookmarkEnd w:id="48"/>
+    <w:bookmarkStart w:id="49" w:name="recommended-turn-1-deployment"/>
+    <w:p>
+      <w:pPr>
+        <w:pStyle w:val="Heading3"/>
+      </w:pPr>
+      <w:r>
+        <w:t xml:space="preserve">Recommended Turn 1 Deployment</w:t>
+      </w:r>
+    </w:p>
+    <w:tbl>
+      <w:tblPr>
+        <w:tblStyle w:val="Table"/>
+        <w:tblW w:type="pct" w:w="5000"/>
+        <w:tblLayout w:type="fixed"/>
+        <w:tblLook w:firstRow="1" w:lastRow="0" w:firstColumn="0" w:lastColumn="0" w:noHBand="0" w:noVBand="0" w:val="0020"/>
+      </w:tblPr>
+      <w:tblGrid>
+        <w:gridCol w:w="1980"/>
+        <w:gridCol w:w="3677"/>
+        <w:gridCol w:w="2262"/>
+      </w:tblGrid>
+      <w:tr>
+        <w:trPr>
+          <w:tblHeader w:val="on"/>
+        </w:trPr>
+        <w:tc>
+          <w:tcPr/>
+          <w:p>
+            <w:pPr>
+              <w:pStyle w:val="Compact"/>
+            </w:pPr>
+            <w:r>
+              <w:t xml:space="preserve">Drone</w:t>
+            </w:r>
+          </w:p>
+        </w:tc>
+        <w:tc>
+          <w:tcPr/>
+          <w:p>
+            <w:pPr>
+              <w:pStyle w:val="Compact"/>
+            </w:pPr>
+            <w:r>
+              <w:t xml:space="preserve">Assigned To</w:t>
+            </w:r>
+          </w:p>
+        </w:tc>
+        <w:tc>
+          <w:tcPr/>
+          <w:p>
+            <w:pPr>
+              <w:pStyle w:val="Compact"/>
+            </w:pPr>
+            <w:r>
+              <w:t xml:space="preserve">Reason</w:t>
+            </w:r>
+          </w:p>
+        </w:tc>
+      </w:tr>
+      <w:tr>
+        <w:tc>
+          <w:tcPr/>
+          <w:p>
+            <w:pPr>
+              <w:pStyle w:val="Compact"/>
+            </w:pPr>
+            <w:r>
+              <w:t xml:space="preserve">Gatherer 1</w:t>
+            </w:r>
+          </w:p>
+        </w:tc>
+        <w:tc>
+          <w:tcPr/>
+          <w:p>
+            <w:pPr>
+              <w:pStyle w:val="Compact"/>
+            </w:pPr>
+            <w:r>
+              <w:t xml:space="preserve">Proxima b (night side)</w:t>
+            </w:r>
+          </w:p>
+        </w:tc>
+        <w:tc>
+          <w:tcPr/>
+          <w:p>
+            <w:pPr>
+              <w:pStyle w:val="Compact"/>
+            </w:pPr>
+            <w:r>
+              <w:t xml:space="preserve">Raw Materials — shielded from flare damage</w:t>
+            </w:r>
+          </w:p>
+        </w:tc>
+      </w:tr>
+      <w:tr>
+        <w:tc>
+          <w:tcPr/>
+          <w:p>
+            <w:pPr>
+              <w:pStyle w:val="Compact"/>
+            </w:pPr>
+            <w:r>
+              <w:t xml:space="preserve">Gatherer 2</w:t>
+            </w:r>
+          </w:p>
+        </w:tc>
+        <w:tc>
+          <w:tcPr/>
+          <w:p>
+            <w:pPr>
+              <w:pStyle w:val="Compact"/>
+            </w:pPr>
+            <w:r>
+              <w:t xml:space="preserve">Proxima b (night side)</w:t>
+            </w:r>
+          </w:p>
+        </w:tc>
+        <w:tc>
+          <w:tcPr/>
+          <w:p>
+            <w:pPr>
+              <w:pStyle w:val="Compact"/>
+            </w:pPr>
+            <w:r>
+              <w:t xml:space="preserve">Second drone doubles early build rate</w:t>
+            </w:r>
+          </w:p>
+        </w:tc>
+      </w:tr>
+      <w:tr>
+        <w:tc>
+          <w:tcPr/>
+          <w:p>
+            <w:pPr>
+              <w:pStyle w:val="Compact"/>
+            </w:pPr>
+            <w:r>
+              <w:t xml:space="preserve">Gatherer 3</w:t>
+            </w:r>
+          </w:p>
+        </w:tc>
+        <w:tc>
+          <w:tcPr/>
+          <w:p>
+            <w:pPr>
+              <w:pStyle w:val="Compact"/>
+            </w:pPr>
+            <w:r>
+              <w:t xml:space="preserve">Proxima b (terminator)</w:t>
+            </w:r>
+          </w:p>
+        </w:tc>
+        <w:tc>
+          <w:tcPr/>
+          <w:p>
+            <w:pPr>
+              <w:pStyle w:val="Compact"/>
+            </w:pPr>
+            <w:r>
+              <w:t xml:space="preserve">Hydrogen extraction from ice deposits in twilight zone</w:t>
+            </w:r>
+          </w:p>
+        </w:tc>
+      </w:tr>
+      <w:tr>
+        <w:tc>
+          <w:tcPr/>
+          <w:p>
+            <w:pPr>
+              <w:pStyle w:val="Compact"/>
+            </w:pPr>
+            <w:r>
+              <w:t xml:space="preserve">Scout 1</w:t>
+            </w:r>
+          </w:p>
+        </w:tc>
+        <w:tc>
+          <w:tcPr/>
+          <w:p>
+            <w:pPr>
+              <w:pStyle w:val="Compact"/>
+            </w:pPr>
+            <w:r>
+              <w:t xml:space="preserve">Proxima d</w:t>
+            </w:r>
+          </w:p>
+        </w:tc>
+        <w:tc>
+          <w:tcPr/>
+          <w:p>
+            <w:pPr>
+              <w:pStyle w:val="Compact"/>
+            </w:pPr>
+            <w:r>
+              <w:t xml:space="preserve">Surveys Class B deposit; marks Rare Metal trace for Era 2 revisit</w:t>
+            </w:r>
+          </w:p>
+        </w:tc>
+      </w:tr>
+    </w:tbl>
+    <w:bookmarkEnd w:id="49"/>
+    <w:bookmarkStart w:id="50" w:name="what-you-can-see-but-cant-touch-yet"/>
+    <w:p>
+      <w:pPr>
+        <w:pStyle w:val="Heading3"/>
+      </w:pPr>
+      <w:r>
+        <w:t xml:space="preserve">What You Can See But Can’t Touch Yet</w:t>
+      </w:r>
+    </w:p>
+    <w:p>
+      <w:pPr>
+        <w:pStyle w:val="Compact"/>
+        <w:numPr>
+          <w:ilvl w:val="0"/>
+          <w:numId w:val="1004"/>
+        </w:numPr>
+      </w:pPr>
+      <w:r>
+        <w:rPr>
+          <w:b/>
+          <w:bCs/>
+        </w:rPr>
+        <w:t xml:space="preserve">Proxima d</w:t>
+      </w:r>
+      <w:r>
+        <w:t xml:space="preserve"> </w:t>
+      </w:r>
+      <w:r>
+        <w:t xml:space="preserve">Rare Metal trace visible on survey — locked until Era 2 Gatherer</w:t>
+      </w:r>
+    </w:p>
+    <w:p>
+      <w:pPr>
+        <w:pStyle w:val="Compact"/>
+        <w:numPr>
+          <w:ilvl w:val="0"/>
+          <w:numId w:val="1004"/>
+        </w:numPr>
+      </w:pPr>
+      <w:r>
+        <w:rPr>
+          <w:b/>
+          <w:bCs/>
+        </w:rPr>
+        <w:t xml:space="preserve">Proxima c signal</w:t>
+      </w:r>
+      <w:r>
+        <w:t xml:space="preserve"> </w:t>
+      </w:r>
+      <w:r>
+        <w:t xml:space="preserve">detectable at ~1.5 AU — nature unknown until Scout surveys it</w:t>
+      </w:r>
+    </w:p>
+    <w:p>
+      <w:pPr>
+        <w:pStyle w:val="Compact"/>
+        <w:numPr>
+          <w:ilvl w:val="0"/>
+          <w:numId w:val="1004"/>
+        </w:numPr>
+      </w:pPr>
+      <w:r>
+        <w:t xml:space="preserve">Era 1 drones mining d return Raw Materials only; heavy elements swept out as slag</w:t>
+      </w:r>
+    </w:p>
+    <w:p>
+      <w:pPr>
+        <w:pStyle w:val="FirstParagraph"/>
+      </w:pPr>
+      <w:r>
+        <w:t xml:space="preserve">Every Class B–D deposit is worth revisiting. Nothing is wasted — you just don’t have the tools yet.</w:t>
+      </w:r>
+    </w:p>
     <w:p>
       <w:r>
         <w:pict>
@@ -10778,17 +11970,266 @@
         </w:pict>
       </w:r>
     </w:p>
+    <w:bookmarkEnd w:id="50"/>
+    <w:bookmarkEnd w:id="51"/>
+    <w:bookmarkStart w:id="55" w:name="win-conditions"/>
+    <w:p>
+      <w:pPr>
+        <w:pStyle w:val="Heading2"/>
+      </w:pPr>
+      <w:r>
+        <w:t xml:space="preserve">Win Conditions</w:t>
+      </w:r>
+    </w:p>
+    <w:bookmarkStart w:id="52" w:name="expansion-victory"/>
+    <w:p>
+      <w:pPr>
+        <w:pStyle w:val="Heading3"/>
+      </w:pPr>
+      <w:r>
+        <w:t xml:space="preserve">Expansion Victory</w:t>
+      </w:r>
+    </w:p>
+    <w:p>
+      <w:pPr>
+        <w:pStyle w:val="Compact"/>
+        <w:numPr>
+          <w:ilvl w:val="0"/>
+          <w:numId w:val="1005"/>
+        </w:numPr>
+      </w:pPr>
+      <w:r>
+        <w:t xml:space="preserve">Control a majority of star systems on the map</w:t>
+      </w:r>
+    </w:p>
+    <w:p>
+      <w:pPr>
+        <w:pStyle w:val="Compact"/>
+        <w:numPr>
+          <w:ilvl w:val="0"/>
+          <w:numId w:val="1005"/>
+        </w:numPr>
+      </w:pPr>
+      <w:r>
+        <w:t xml:space="preserve">Achieved by printing Torches and claiming systems faster than any opponent</w:t>
+      </w:r>
+    </w:p>
+    <w:p>
+      <w:pPr>
+        <w:pStyle w:val="Compact"/>
+        <w:numPr>
+          <w:ilvl w:val="0"/>
+          <w:numId w:val="1005"/>
+        </w:numPr>
+      </w:pPr>
+      <w:r>
+        <w:rPr>
+          <w:b/>
+          <w:bCs/>
+        </w:rPr>
+        <w:t xml:space="preserve">Trade-offs:</w:t>
+      </w:r>
+      <w:r>
+        <w:t xml:space="preserve"> </w:t>
+      </w:r>
+      <w:r>
+        <w:t xml:space="preserve">Energy flows to printers and Torches, not research — Era 4 elite tech is rarely reached; military units stay Era 1–2 quality; He-3 propulsion is used longer than the Tech path</w:t>
+      </w:r>
+    </w:p>
+    <w:bookmarkEnd w:id="52"/>
+    <w:bookmarkStart w:id="53" w:name="tech-victory"/>
+    <w:p>
+      <w:pPr>
+        <w:pStyle w:val="Heading3"/>
+      </w:pPr>
+      <w:r>
+        <w:t xml:space="preserve">Tech Victory</w:t>
+      </w:r>
+    </w:p>
+    <w:p>
+      <w:pPr>
+        <w:pStyle w:val="Compact"/>
+        <w:numPr>
+          <w:ilvl w:val="0"/>
+          <w:numId w:val="1006"/>
+        </w:numPr>
+      </w:pPr>
+      <w:r>
+        <w:t xml:space="preserve">Complete the full local research tree and construct the</w:t>
+      </w:r>
+      <w:r>
+        <w:t xml:space="preserve"> </w:t>
+      </w:r>
+      <w:r>
+        <w:rPr>
+          <w:b/>
+          <w:bCs/>
+        </w:rPr>
+        <w:t xml:space="preserve">Capstone Structure</w:t>
+      </w:r>
+      <w:r>
+        <w:t xml:space="preserve"> </w:t>
+      </w:r>
+      <w:r>
+        <w:t xml:space="preserve">(TBD)</w:t>
+      </w:r>
+    </w:p>
+    <w:p>
+      <w:pPr>
+        <w:pStyle w:val="Compact"/>
+        <w:numPr>
+          <w:ilvl w:val="0"/>
+          <w:numId w:val="1006"/>
+        </w:numPr>
+      </w:pPr>
+      <w:r>
+        <w:t xml:space="preserve">Achieved by investing deeply in Research Stations and upgrades before replicating</w:t>
+      </w:r>
+    </w:p>
+    <w:p>
+      <w:pPr>
+        <w:pStyle w:val="Compact"/>
+        <w:numPr>
+          <w:ilvl w:val="0"/>
+          <w:numId w:val="1006"/>
+        </w:numPr>
+      </w:pPr>
+      <w:r>
+        <w:rPr>
+          <w:b/>
+          <w:bCs/>
+        </w:rPr>
+        <w:t xml:space="preserve">Trade-offs:</w:t>
+      </w:r>
+      <w:r>
+        <w:t xml:space="preserve"> </w:t>
+      </w:r>
+      <w:r>
+        <w:t xml:space="preserve">Small empire footprint; fewer raw resources; vulnerable mid-game until tech matures</w:t>
+      </w:r>
+    </w:p>
+    <w:bookmarkEnd w:id="53"/>
+    <w:bookmarkStart w:id="54" w:name="balance-lever-energy"/>
+    <w:p>
+      <w:pPr>
+        <w:pStyle w:val="Heading3"/>
+      </w:pPr>
+      <w:r>
+        <w:t xml:space="preserve">Balance Lever — Energy</w:t>
+      </w:r>
+    </w:p>
     <w:p>
       <w:pPr>
         <w:pStyle w:val="FirstParagraph"/>
       </w:pPr>
       <w:r>
+        <w:t xml:space="preserve">Both paths compete for the same resource. Energy spent on expansion delays tech. Energy spent on tech delays expansion. This forces path commitment.</w:t>
+      </w:r>
+    </w:p>
+    <w:tbl>
+      <w:tblPr>
+        <w:tblStyle w:val="Table"/>
+        <w:tblW w:type="auto" w:w="0"/>
+        <w:tblLook w:firstRow="1" w:lastRow="0" w:firstColumn="0" w:lastColumn="0" w:noHBand="0" w:noVBand="0" w:val="0020"/>
+      </w:tblPr>
+      <w:tblGrid>
+        <w:gridCol w:w="3960"/>
+        <w:gridCol w:w="3960"/>
+      </w:tblGrid>
+      <w:tr>
+        <w:trPr>
+          <w:tblHeader w:val="on"/>
+        </w:trPr>
+        <w:tc>
+          <w:tcPr/>
+          <w:p>
+            <w:pPr>
+              <w:pStyle w:val="Compact"/>
+            </w:pPr>
+            <w:r>
+              <w:t xml:space="preserve">Energy Spent On</w:t>
+            </w:r>
+          </w:p>
+        </w:tc>
+        <w:tc>
+          <w:tcPr/>
+          <w:p>
+            <w:pPr>
+              <w:pStyle w:val="Compact"/>
+            </w:pPr>
+            <w:r>
+              <w:t xml:space="preserve">Result</w:t>
+            </w:r>
+          </w:p>
+        </w:tc>
+      </w:tr>
+      <w:tr>
+        <w:tc>
+          <w:tcPr/>
+          <w:p>
+            <w:pPr>
+              <w:pStyle w:val="Compact"/>
+            </w:pPr>
+            <w:r>
+              <w:t xml:space="preserve">New Printers / Torches</w:t>
+            </w:r>
+          </w:p>
+        </w:tc>
+        <w:tc>
+          <w:tcPr/>
+          <w:p>
+            <w:pPr>
+              <w:pStyle w:val="Compact"/>
+            </w:pPr>
+            <w:r>
+              <w:t xml:space="preserve">Faster expansion, delayed tech</w:t>
+            </w:r>
+          </w:p>
+        </w:tc>
+      </w:tr>
+      <w:tr>
+        <w:tc>
+          <w:tcPr/>
+          <w:p>
+            <w:pPr>
+              <w:pStyle w:val="Compact"/>
+            </w:pPr>
+            <w:r>
+              <w:t xml:space="preserve">Research Stations / Upgrades</w:t>
+            </w:r>
+          </w:p>
+        </w:tc>
+        <w:tc>
+          <w:tcPr/>
+          <w:p>
+            <w:pPr>
+              <w:pStyle w:val="Compact"/>
+            </w:pPr>
+            <w:r>
+              <w:t xml:space="preserve">Deeper tech, slower footprint</w:t>
+            </w:r>
+          </w:p>
+        </w:tc>
+      </w:tr>
+    </w:tbl>
+    <w:p>
+      <w:r>
+        <w:pict>
+          <v:rect style="width:0;height:1.5pt" o:hralign="center" o:hrstd="t" o:hr="t"/>
+        </w:pict>
+      </w:r>
+    </w:p>
+    <w:p>
+      <w:pPr>
+        <w:pStyle w:val="FirstParagraph"/>
+      </w:pPr>
+      <w:r>
         <w:t xml:space="preserve">Last updated: April 2026</w:t>
       </w:r>
     </w:p>
-    <w:bookmarkEnd w:id="44"/>
-    <w:bookmarkEnd w:id="45"/>
-    <w:bookmarkEnd w:id="46"/>
+    <w:bookmarkEnd w:id="54"/>
+    <w:bookmarkEnd w:id="55"/>
+    <w:bookmarkEnd w:id="56"/>
     <w:sectPr>
       <w:footnotePr>
         <w:numRestart w:val="eachSect"/>
@@ -11018,6 +12459,9 @@
     <w:abstractNumId w:val="991"/>
   </w:num>
   <w:num w:numId="1005">
+    <w:abstractNumId w:val="991"/>
+  </w:num>
+  <w:num w:numId="1006">
     <w:abstractNumId w:val="991"/>
   </w:num>
 </w:numbering>

</xml_diff>